<commit_message>
Add offline-first architecture: package and deployment diagrams
</commit_message>
<xml_diff>
--- a/week05/Lab4_Russell-Aka.docx
+++ b/week05/Lab4_Russell-Aka.docx
@@ -906,6 +906,33 @@
           <w:rFonts w:ascii="Times New Roman" w:hAnsi="Times New Roman" w:cs="Times New Roman"/>
         </w:rPr>
       </w:pPr>
+    </w:p>
+    <w:p>
+      <w:pPr>
+        <w:rPr>
+          <w:rFonts w:ascii="Times New Roman" w:hAnsi="Times New Roman" w:cs="Times New Roman"/>
+          <w:b/>
+          <w:bCs/>
+        </w:rPr>
+      </w:pPr>
+      <w:r>
+        <w:rPr>
+          <w:rFonts w:ascii="Times New Roman" w:hAnsi="Times New Roman" w:cs="Times New Roman"/>
+          <w:b/>
+          <w:bCs/>
+        </w:rPr>
+        <w:t>PUML file can be found in week05</w:t>
+      </w:r>
+      <w:proofErr w:type="gramStart"/>
+      <w:r>
+        <w:rPr>
+          <w:rFonts w:ascii="Times New Roman" w:hAnsi="Times New Roman" w:cs="Times New Roman"/>
+          <w:b/>
+          <w:bCs/>
+        </w:rPr>
+        <w:t>/..</w:t>
+      </w:r>
+      <w:proofErr w:type="gramEnd"/>
     </w:p>
     <w:p>
       <w:pPr>

</xml_diff>